<commit_message>
Centralize figure assets under figures
</commit_message>
<xml_diff>
--- a/figure_package/figures_through_simulation2.docx
+++ b/figure_package/figures_through_simulation2.docx
@@ -106,7 +106,7 @@
               <a:graphicData uri="http://schemas.openxmlformats.org/drawingml/2006/picture">
                 <pic:pic>
                   <pic:nvPicPr>
-                    <pic:cNvPr descr="../empirical_target_figure/empirical_target_composite.png" id="23" name="Picture"/>
+                    <pic:cNvPr descr="../figures/empirical_target/empirical_target_composite.png" id="23" name="Picture"/>
                     <pic:cNvPicPr>
                       <a:picLocks noChangeArrowheads="1" noChangeAspect="1"/>
                     </pic:cNvPicPr>
@@ -182,7 +182,7 @@
               <a:graphicData uri="http://schemas.openxmlformats.org/drawingml/2006/picture">
                 <pic:pic>
                   <pic:nvPicPr>
-                    <pic:cNvPr descr="../empirical_target_figure/empirical_selective_interference_examples.png" id="26" name="Picture"/>
+                    <pic:cNvPr descr="../figures/empirical_target/empirical_selective_interference_examples.png" id="26" name="Picture"/>
                     <pic:cNvPicPr>
                       <a:picLocks noChangeArrowheads="1" noChangeAspect="1"/>
                     </pic:cNvPicPr>
@@ -268,7 +268,7 @@
               <a:graphicData uri="http://schemas.openxmlformats.org/drawingml/2006/picture">
                 <pic:pic>
                   <pic:nvPicPr>
-                    <pic:cNvPr descr="../retrieved_context_account_figure/retrieved_context_encoding_associations_composite.png" id="30" name="Picture"/>
+                    <pic:cNvPr descr="../figures/retrieved_context_account/retrieved_context_encoding_associations_composite.png" id="30" name="Picture"/>
                     <pic:cNvPicPr>
                       <a:picLocks noChangeArrowheads="1" noChangeAspect="1"/>
                     </pic:cNvPicPr>
@@ -344,7 +344,7 @@
               <a:graphicData uri="http://schemas.openxmlformats.org/drawingml/2006/picture">
                 <pic:pic>
                   <pic:nvPicPr>
-                    <pic:cNvPr descr="../retrieved_context_account_figure/retrieved_context_retrieval_operations_composite.png" id="33" name="Picture"/>
+                    <pic:cNvPr descr="../figures/retrieved_context_account/retrieved_context_retrieval_operations_composite.png" id="33" name="Picture"/>
                     <pic:cNvPicPr>
                       <a:picLocks noChangeArrowheads="1" noChangeAspect="1"/>
                     </pic:cNvPicPr>

</xml_diff>

<commit_message>
Organize figure assets by role
</commit_message>
<xml_diff>
--- a/figure_package/figures_through_simulation2.docx
+++ b/figure_package/figures_through_simulation2.docx
@@ -106,7 +106,7 @@
               <a:graphicData uri="http://schemas.openxmlformats.org/drawingml/2006/picture">
                 <pic:pic>
                   <pic:nvPicPr>
-                    <pic:cNvPr descr="../figures/empirical_target/empirical_target_composite.png" id="23" name="Picture"/>
+                    <pic:cNvPr descr="../figures/manuscript/empirical_target/empirical_target_composite.png" id="23" name="Picture"/>
                     <pic:cNvPicPr>
                       <a:picLocks noChangeArrowheads="1" noChangeAspect="1"/>
                     </pic:cNvPicPr>
@@ -182,7 +182,7 @@
               <a:graphicData uri="http://schemas.openxmlformats.org/drawingml/2006/picture">
                 <pic:pic>
                   <pic:nvPicPr>
-                    <pic:cNvPr descr="../figures/empirical_target/empirical_selective_interference_examples.png" id="26" name="Picture"/>
+                    <pic:cNvPr descr="../figures/manuscript/empirical_target/empirical_selective_interference_examples.png" id="26" name="Picture"/>
                     <pic:cNvPicPr>
                       <a:picLocks noChangeArrowheads="1" noChangeAspect="1"/>
                     </pic:cNvPicPr>
@@ -268,7 +268,7 @@
               <a:graphicData uri="http://schemas.openxmlformats.org/drawingml/2006/picture">
                 <pic:pic>
                   <pic:nvPicPr>
-                    <pic:cNvPr descr="../figures/retrieved_context_account/retrieved_context_encoding_associations_composite.png" id="30" name="Picture"/>
+                    <pic:cNvPr descr="../figures/manuscript/retrieved_context_account/retrieved_context_encoding_associations_composite.png" id="30" name="Picture"/>
                     <pic:cNvPicPr>
                       <a:picLocks noChangeArrowheads="1" noChangeAspect="1"/>
                     </pic:cNvPicPr>
@@ -344,7 +344,7 @@
               <a:graphicData uri="http://schemas.openxmlformats.org/drawingml/2006/picture">
                 <pic:pic>
                   <pic:nvPicPr>
-                    <pic:cNvPr descr="../figures/retrieved_context_account/retrieved_context_retrieval_operations_composite.png" id="33" name="Picture"/>
+                    <pic:cNvPr descr="../figures/manuscript/retrieved_context_account/retrieved_context_retrieval_operations_composite.png" id="33" name="Picture"/>
                     <pic:cNvPicPr>
                       <a:picLocks noChangeArrowheads="1" noChangeAspect="1"/>
                     </pic:cNvPicPr>
@@ -423,14 +423,14 @@
       <w:r>
         <w:drawing>
           <wp:inline>
-            <wp:extent cx="5334000" cy="4714264"/>
+            <wp:extent cx="5334000" cy="4710489"/>
             <wp:effectExtent b="0" l="0" r="0" t="0"/>
             <wp:docPr descr="" title="" id="36" name="Picture"/>
             <a:graphic>
               <a:graphicData uri="http://schemas.openxmlformats.org/drawingml/2006/picture">
                 <pic:pic>
                   <pic:nvPicPr>
-                    <pic:cNvPr descr="../figures/simulation1_unguided_cued_sequence_summary.png" id="37" name="Picture"/>
+                    <pic:cNvPr descr="../figures/manuscript/simulation1/simulation1_unguided_cued_sequence_summary.png" id="37" name="Picture"/>
                     <pic:cNvPicPr>
                       <a:picLocks noChangeArrowheads="1" noChangeAspect="1"/>
                     </pic:cNvPicPr>
@@ -444,7 +444,7 @@
                   <pic:spPr bwMode="auto">
                     <a:xfrm>
                       <a:off x="0" y="0"/>
-                      <a:ext cx="5334000" cy="4714264"/>
+                      <a:ext cx="5334000" cy="4710489"/>
                     </a:xfrm>
                     <a:prstGeom prst="rect">
                       <a:avLst/>
@@ -499,14 +499,14 @@
       <w:r>
         <w:drawing>
           <wp:inline>
-            <wp:extent cx="5334000" cy="5016472"/>
+            <wp:extent cx="5334000" cy="5011008"/>
             <wp:effectExtent b="0" l="0" r="0" t="0"/>
             <wp:docPr descr="" title="" id="39" name="Picture"/>
             <a:graphic>
               <a:graphicData uri="http://schemas.openxmlformats.org/drawingml/2006/picture">
                 <pic:pic>
                   <pic:nvPicPr>
-                    <pic:cNvPr descr="../figures/simulation1_unguided_cued_recall_distributions.png" id="40" name="Picture"/>
+                    <pic:cNvPr descr="../figures/manuscript/simulation1/simulation1_unguided_cued_recall_distributions.png" id="40" name="Picture"/>
                     <pic:cNvPicPr>
                       <a:picLocks noChangeArrowheads="1" noChangeAspect="1"/>
                     </pic:cNvPicPr>
@@ -520,7 +520,7 @@
                   <pic:spPr bwMode="auto">
                     <a:xfrm>
                       <a:off x="0" y="0"/>
-                      <a:ext cx="5334000" cy="5016472"/>
+                      <a:ext cx="5334000" cy="5011008"/>
                     </a:xfrm>
                     <a:prstGeom prst="rect">
                       <a:avLst/>
@@ -575,14 +575,14 @@
       <w:r>
         <w:drawing>
           <wp:inline>
-            <wp:extent cx="5334000" cy="5080000"/>
+            <wp:extent cx="5334000" cy="5073804"/>
             <wp:effectExtent b="0" l="0" r="0" t="0"/>
             <wp:docPr descr="" title="" id="42" name="Picture"/>
             <a:graphic>
               <a:graphicData uri="http://schemas.openxmlformats.org/drawingml/2006/picture">
                 <pic:pic>
                   <pic:nvPicPr>
-                    <pic:cNvPr descr="../figures/simulation1_unguided_cued_context_overlap.png" id="43" name="Picture"/>
+                    <pic:cNvPr descr="../figures/manuscript/simulation1/simulation1_unguided_cued_context_overlap.png" id="43" name="Picture"/>
                     <pic:cNvPicPr>
                       <a:picLocks noChangeArrowheads="1" noChangeAspect="1"/>
                     </pic:cNvPicPr>
@@ -596,7 +596,7 @@
                   <pic:spPr bwMode="auto">
                     <a:xfrm>
                       <a:off x="0" y="0"/>
-                      <a:ext cx="5334000" cy="5080000"/>
+                      <a:ext cx="5334000" cy="5073804"/>
                     </a:xfrm>
                     <a:prstGeom prst="rect">
                       <a:avLst/>
@@ -668,7 +668,7 @@
               <a:graphicData uri="http://schemas.openxmlformats.org/drawingml/2006/picture">
                 <pic:pic>
                   <pic:nvPicPr>
-                    <pic:cNvPr descr="../figures/simulation2_control_cued_behavioral.png" id="47" name="Picture"/>
+                    <pic:cNvPr descr="../figures/manuscript/simulation2/simulation2_control_cued_behavioral.png" id="47" name="Picture"/>
                     <pic:cNvPicPr>
                       <a:picLocks noChangeArrowheads="1" noChangeAspect="1"/>
                     </pic:cNvPicPr>
@@ -744,7 +744,7 @@
               <a:graphicData uri="http://schemas.openxmlformats.org/drawingml/2006/picture">
                 <pic:pic>
                   <pic:nvPicPr>
-                    <pic:cNvPr descr="../figures/simulation2_retrieval_control_decomposition.png" id="50" name="Picture"/>
+                    <pic:cNvPr descr="../figures/manuscript/simulation2/simulation2_retrieval_control_decomposition.png" id="50" name="Picture"/>
                     <pic:cNvPicPr>
                       <a:picLocks noChangeArrowheads="1" noChangeAspect="1"/>
                     </pic:cNvPicPr>
@@ -813,14 +813,14 @@
       <w:r>
         <w:drawing>
           <wp:inline>
-            <wp:extent cx="5334000" cy="5080000"/>
+            <wp:extent cx="5334000" cy="5073804"/>
             <wp:effectExtent b="0" l="0" r="0" t="0"/>
             <wp:docPr descr="" title="" id="52" name="Picture"/>
             <a:graphic>
               <a:graphicData uri="http://schemas.openxmlformats.org/drawingml/2006/picture">
                 <pic:pic>
                   <pic:nvPicPr>
-                    <pic:cNvPr descr="../figures/simulation2_film_retrieval_goal_context_overlap.png" id="53" name="Picture"/>
+                    <pic:cNvPr descr="../figures/manuscript/simulation2/simulation2_film_retrieval_goal_context_overlap.png" id="53" name="Picture"/>
                     <pic:cNvPicPr>
                       <a:picLocks noChangeArrowheads="1" noChangeAspect="1"/>
                     </pic:cNvPicPr>
@@ -834,7 +834,7 @@
                   <pic:spPr bwMode="auto">
                     <a:xfrm>
                       <a:off x="0" y="0"/>
-                      <a:ext cx="5334000" cy="5080000"/>
+                      <a:ext cx="5334000" cy="5073804"/>
                     </a:xfrm>
                     <a:prstGeom prst="rect">
                       <a:avLst/>
@@ -889,14 +889,14 @@
       <w:r>
         <w:drawing>
           <wp:inline>
-            <wp:extent cx="5334000" cy="5042187"/>
+            <wp:extent cx="5334000" cy="5036698"/>
             <wp:effectExtent b="0" l="0" r="0" t="0"/>
             <wp:docPr descr="" title="" id="55" name="Picture"/>
             <a:graphic>
               <a:graphicData uri="http://schemas.openxmlformats.org/drawingml/2006/picture">
                 <pic:pic>
                   <pic:nvPicPr>
-                    <pic:cNvPr descr="../figures/simulation2_start_context_reinstatement.png" id="56" name="Picture"/>
+                    <pic:cNvPr descr="../figures/manuscript/simulation2/simulation2_start_context_reinstatement.png" id="56" name="Picture"/>
                     <pic:cNvPicPr>
                       <a:picLocks noChangeArrowheads="1" noChangeAspect="1"/>
                     </pic:cNvPicPr>
@@ -910,7 +910,7 @@
                   <pic:spPr bwMode="auto">
                     <a:xfrm>
                       <a:off x="0" y="0"/>
-                      <a:ext cx="5334000" cy="5042187"/>
+                      <a:ext cx="5334000" cy="5036698"/>
                     </a:xfrm>
                     <a:prstGeom prst="rect">
                       <a:avLst/>
@@ -965,14 +965,14 @@
       <w:r>
         <w:drawing>
           <wp:inline>
-            <wp:extent cx="5334000" cy="5066184"/>
+            <wp:extent cx="5334000" cy="5060611"/>
             <wp:effectExtent b="0" l="0" r="0" t="0"/>
             <wp:docPr descr="" title="" id="58" name="Picture"/>
             <a:graphic>
               <a:graphicData uri="http://schemas.openxmlformats.org/drawingml/2006/picture">
                 <pic:pic>
                   <pic:nvPicPr>
-                    <pic:cNvPr descr="../figures/simulation2_target_monitoring_diagnostic.png" id="59" name="Picture"/>
+                    <pic:cNvPr descr="../figures/manuscript/simulation2/simulation2_target_monitoring_diagnostic.png" id="59" name="Picture"/>
                     <pic:cNvPicPr>
                       <a:picLocks noChangeArrowheads="1" noChangeAspect="1"/>
                     </pic:cNvPicPr>
@@ -986,7 +986,7 @@
                   <pic:spPr bwMode="auto">
                     <a:xfrm>
                       <a:off x="0" y="0"/>
-                      <a:ext cx="5334000" cy="5066184"/>
+                      <a:ext cx="5334000" cy="5060611"/>
                     </a:xfrm>
                     <a:prstGeom prst="rect">
                       <a:avLst/>

</xml_diff>

<commit_message>
Reorganize analysis artifacts under work/
</commit_message>
<xml_diff>
--- a/figure_package/figures_through_simulation2.docx
+++ b/figure_package/figures_through_simulation2.docx
@@ -106,7 +106,7 @@
               <a:graphicData uri="http://schemas.openxmlformats.org/drawingml/2006/picture">
                 <pic:pic>
                   <pic:nvPicPr>
-                    <pic:cNvPr descr="../figures/manuscript/empirical_target/empirical_target_composite.png" id="23" name="Picture"/>
+                    <pic:cNvPr descr="../work/empirical_target/empirical_target_composite.png" id="23" name="Picture"/>
                     <pic:cNvPicPr>
                       <a:picLocks noChangeArrowheads="1" noChangeAspect="1"/>
                     </pic:cNvPicPr>
@@ -182,7 +182,7 @@
               <a:graphicData uri="http://schemas.openxmlformats.org/drawingml/2006/picture">
                 <pic:pic>
                   <pic:nvPicPr>
-                    <pic:cNvPr descr="../figures/manuscript/empirical_target/empirical_selective_interference_examples.png" id="26" name="Picture"/>
+                    <pic:cNvPr descr="../work/empirical_target/empirical_selective_interference_examples.png" id="26" name="Picture"/>
                     <pic:cNvPicPr>
                       <a:picLocks noChangeArrowheads="1" noChangeAspect="1"/>
                     </pic:cNvPicPr>
@@ -268,7 +268,7 @@
               <a:graphicData uri="http://schemas.openxmlformats.org/drawingml/2006/picture">
                 <pic:pic>
                   <pic:nvPicPr>
-                    <pic:cNvPr descr="../figures/manuscript/retrieved_context_account/retrieved_context_encoding_associations_composite.png" id="30" name="Picture"/>
+                    <pic:cNvPr descr="../work/retrieved_context_account/retrieved_context_encoding_associations_composite.png" id="30" name="Picture"/>
                     <pic:cNvPicPr>
                       <a:picLocks noChangeArrowheads="1" noChangeAspect="1"/>
                     </pic:cNvPicPr>
@@ -344,7 +344,7 @@
               <a:graphicData uri="http://schemas.openxmlformats.org/drawingml/2006/picture">
                 <pic:pic>
                   <pic:nvPicPr>
-                    <pic:cNvPr descr="../figures/manuscript/retrieved_context_account/retrieved_context_retrieval_operations_composite.png" id="33" name="Picture"/>
+                    <pic:cNvPr descr="../work/retrieved_context_account/retrieved_context_retrieval_operations_composite.png" id="33" name="Picture"/>
                     <pic:cNvPicPr>
                       <a:picLocks noChangeArrowheads="1" noChangeAspect="1"/>
                     </pic:cNvPicPr>
@@ -430,7 +430,7 @@
               <a:graphicData uri="http://schemas.openxmlformats.org/drawingml/2006/picture">
                 <pic:pic>
                   <pic:nvPicPr>
-                    <pic:cNvPr descr="../figures/manuscript/simulation1/simulation1_unguided_cued_sequence_summary.png" id="37" name="Picture"/>
+                    <pic:cNvPr descr="../work/simulation1_unguided_cued/simulation1_unguided_cued_sequence_summary.png" id="37" name="Picture"/>
                     <pic:cNvPicPr>
                       <a:picLocks noChangeArrowheads="1" noChangeAspect="1"/>
                     </pic:cNvPicPr>
@@ -506,7 +506,7 @@
               <a:graphicData uri="http://schemas.openxmlformats.org/drawingml/2006/picture">
                 <pic:pic>
                   <pic:nvPicPr>
-                    <pic:cNvPr descr="../figures/manuscript/simulation1/simulation1_unguided_cued_recall_distributions.png" id="40" name="Picture"/>
+                    <pic:cNvPr descr="../work/simulation1_unguided_cued/simulation1_unguided_cued_recall_distributions.png" id="40" name="Picture"/>
                     <pic:cNvPicPr>
                       <a:picLocks noChangeArrowheads="1" noChangeAspect="1"/>
                     </pic:cNvPicPr>
@@ -582,7 +582,7 @@
               <a:graphicData uri="http://schemas.openxmlformats.org/drawingml/2006/picture">
                 <pic:pic>
                   <pic:nvPicPr>
-                    <pic:cNvPr descr="../figures/manuscript/simulation1/simulation1_unguided_cued_context_overlap.png" id="43" name="Picture"/>
+                    <pic:cNvPr descr="../work/simulation1_unguided_cued/simulation1_unguided_cued_context_overlap.png" id="43" name="Picture"/>
                     <pic:cNvPicPr>
                       <a:picLocks noChangeArrowheads="1" noChangeAspect="1"/>
                     </pic:cNvPicPr>
@@ -668,7 +668,7 @@
               <a:graphicData uri="http://schemas.openxmlformats.org/drawingml/2006/picture">
                 <pic:pic>
                   <pic:nvPicPr>
-                    <pic:cNvPr descr="../figures/manuscript/simulation2/simulation2_control_cued_behavioral.png" id="47" name="Picture"/>
+                    <pic:cNvPr descr="../work/simulation2_control_cued_behavioral/simulation2_control_cued_behavioral.png" id="47" name="Picture"/>
                     <pic:cNvPicPr>
                       <a:picLocks noChangeArrowheads="1" noChangeAspect="1"/>
                     </pic:cNvPicPr>
@@ -744,7 +744,7 @@
               <a:graphicData uri="http://schemas.openxmlformats.org/drawingml/2006/picture">
                 <pic:pic>
                   <pic:nvPicPr>
-                    <pic:cNvPr descr="../figures/manuscript/simulation2/simulation2_retrieval_control_decomposition.png" id="50" name="Picture"/>
+                    <pic:cNvPr descr="../work/simulation2_retrieval_control_decomposition/simulation2_retrieval_control_decomposition.png" id="50" name="Picture"/>
                     <pic:cNvPicPr>
                       <a:picLocks noChangeArrowheads="1" noChangeAspect="1"/>
                     </pic:cNvPicPr>
@@ -820,7 +820,7 @@
               <a:graphicData uri="http://schemas.openxmlformats.org/drawingml/2006/picture">
                 <pic:pic>
                   <pic:nvPicPr>
-                    <pic:cNvPr descr="../figures/manuscript/simulation2/simulation2_film_retrieval_goal_context_overlap.png" id="53" name="Picture"/>
+                    <pic:cNvPr descr="../work/simulation2_film_retrieval_goal_context_overlap/simulation2_film_retrieval_goal_context_overlap.png" id="53" name="Picture"/>
                     <pic:cNvPicPr>
                       <a:picLocks noChangeArrowheads="1" noChangeAspect="1"/>
                     </pic:cNvPicPr>
@@ -896,7 +896,7 @@
               <a:graphicData uri="http://schemas.openxmlformats.org/drawingml/2006/picture">
                 <pic:pic>
                   <pic:nvPicPr>
-                    <pic:cNvPr descr="../figures/manuscript/simulation2/simulation2_start_context_reinstatement.png" id="56" name="Picture"/>
+                    <pic:cNvPr descr="../work/simulation2_start_context_reinstatement/simulation2_start_context_reinstatement.png" id="56" name="Picture"/>
                     <pic:cNvPicPr>
                       <a:picLocks noChangeArrowheads="1" noChangeAspect="1"/>
                     </pic:cNvPicPr>
@@ -972,7 +972,7 @@
               <a:graphicData uri="http://schemas.openxmlformats.org/drawingml/2006/picture">
                 <pic:pic>
                   <pic:nvPicPr>
-                    <pic:cNvPr descr="../figures/manuscript/simulation2/simulation2_target_monitoring_diagnostic.png" id="59" name="Picture"/>
+                    <pic:cNvPr descr="../work/simulation2_target_monitoring_diagnostic/simulation2_target_monitoring_diagnostic.png" id="59" name="Picture"/>
                     <pic:cNvPicPr>
                       <a:picLocks noChangeArrowheads="1" noChangeAspect="1"/>
                     </pic:cNvPicPr>

</xml_diff>